<commit_message>
Sync revised EN/RU wisdom stories, harden global search, and refresh Alif art.
Update EN/RU story text, audio, and catalogs from the latest docx revisions; localize My Alif Has Been Dotted illustrations from the AZ master; and make file:// and partial index loads resilient for global search.

Co-authored-by: Cursor <cursoragent@cursor.com>
</commit_message>
<xml_diff>
--- a/en/wisdom-stories/dervishs-clothes.docx
+++ b/en/wisdom-stories/dervishs-clothes.docx
@@ -14,7 +14,7 @@
           <w:color w:val="000000"/>
           <w:sz w:val="52"/>
         </w:rPr>
-        <w:t>The Dervish's Dress</w:t>
+        <w:t>The Dervish’s Appearance</w:t>
       </w:r>
     </w:p>
     <w:p>
@@ -22,13 +22,7 @@
         <w:jc w:val="left"/>
       </w:pPr>
       <w:r>
-        <w:rPr>
-          <w:rFonts w:ascii="Arial" w:hAnsi="Arial" w:eastAsia="Arial"/>
-          <w:i w:val="0"/>
-          <w:color w:val="000000"/>
-          <w:sz w:val="22"/>
-        </w:rPr>
-        <w:t>The Dervish was asked:</w:t>
+        <w:t>A dervish was once asked:</w:t>
       </w:r>
     </w:p>
     <w:p>
@@ -36,13 +30,7 @@
         <w:jc w:val="left"/>
       </w:pPr>
       <w:r>
-        <w:rPr>
-          <w:rFonts w:ascii="Arial" w:hAnsi="Arial" w:eastAsia="Arial"/>
-          <w:i w:val="0"/>
-          <w:color w:val="000000"/>
-          <w:sz w:val="22"/>
-        </w:rPr>
-        <w:t>— Why is your dress so untidy?</w:t>
+        <w:t>— Why are your clothes so untidy?</w:t>
       </w:r>
     </w:p>
     <w:p>
@@ -50,13 +38,7 @@
         <w:jc w:val="left"/>
       </w:pPr>
       <w:r>
-        <w:rPr>
-          <w:rFonts w:ascii="Arial" w:hAnsi="Arial" w:eastAsia="Arial"/>
-          <w:i w:val="0"/>
-          <w:color w:val="000000"/>
-          <w:sz w:val="22"/>
-        </w:rPr>
-        <w:t>The Dervish replied:</w:t>
+        <w:t>He replied:</w:t>
       </w:r>
     </w:p>
     <w:p>
@@ -64,13 +46,7 @@
         <w:jc w:val="left"/>
       </w:pPr>
       <w:r>
-        <w:rPr>
-          <w:rFonts w:ascii="Arial" w:hAnsi="Arial" w:eastAsia="Arial"/>
-          <w:i w:val="0"/>
-          <w:color w:val="000000"/>
-          <w:sz w:val="22"/>
-        </w:rPr>
-        <w:t>— Since I am constantly busy improving my interior, I have no time to improve my exterior.</w:t>
+        <w:t>— I spend so much time working on my inner self that I have little time left to worry about my appearance.</w:t>
       </w:r>
     </w:p>
     <w:p>
@@ -92,23 +68,12 @@
       </w:pPr>
       <w:r>
         <w:rPr>
-          <w:rFonts w:ascii="Arial" w:hAnsi="Arial" w:eastAsia="Arial" w:cs="Arial"/>
           <w:b/>
-          <w:i w:val="0"/>
-          <w:color w:val="9A7417"/>
-          <w:sz w:val="22"/>
         </w:rPr>
         <w:t xml:space="preserve">Moral: </w:t>
       </w:r>
       <w:r>
-        <w:rPr>
-          <w:rFonts w:ascii="Arial" w:hAnsi="Arial" w:eastAsia="Arial" w:cs="Arial"/>
-          <w:b w:val="0"/>
-          <w:i w:val="0"/>
-          <w:color w:val="3F3826"/>
-          <w:sz w:val="22"/>
-        </w:rPr>
-        <w:t>A person who beautifies his inner world does not make external defects a criterion for measurement. Because what makes a person beautiful is not his clothes, but the purity of his heart and the light of his soul.</w:t>
+        <w:t>A person who cultivates the inner life does not judge worth by outward appearance. What truly makes a person beautiful is not clothing, but a pure heart and a luminous spirit.</w:t>
       </w:r>
     </w:p>
     <w:p>

</xml_diff>